<commit_message>
docs: expand technical documentation to cover algorithms and architecture in depth
</commit_message>
<xml_diff>
--- a/docs/FlowMinds_Documentation.docx
+++ b/docs/FlowMinds_Documentation.docx
@@ -8,7 +8,9 @@
         <w:jc w:val="center"/>
       </w:pPr>
       <w:r>
-        <w:t>FlowMinds - Hand Gesture Presentation Control</w:t>
+        <w:t>FlowMinds</w:t>
+        <w:br/>
+        <w:t>Hand Gesture Presentation Control</w:t>
       </w:r>
     </w:p>
     <w:p>
@@ -16,14 +18,32 @@
         <w:jc w:val="center"/>
       </w:pPr>
       <w:r>
-        <w:t>Comprehensive Technical Documentation</w:t>
+        <w:t>Comprehensive Technical &amp; Algorithmic Documentation</w:t>
       </w:r>
     </w:p>
     <w:p>
+      <w:pPr>
+        <w:jc w:val="left"/>
+      </w:pPr>
+      <w:r>
+        <w:br/>
+        <w:br/>
+        <w:br/>
+        <w:br/>
+        <w:br/>
+        <w:br/>
+      </w:r>
+    </w:p>
+    <w:p>
+      <w:pPr>
+        <w:jc w:val="center"/>
+      </w:pPr>
       <w:r>
         <w:t>Course: Embodied Interaction (SS2026)</w:t>
         <w:br/>
         <w:t>Authors: Bashar Haidar &amp; Lana Kara Mohammed</w:t>
+        <w:br/>
+        <w:t>Version: 2.0 (Monorepo Architecture)</w:t>
       </w:r>
     </w:p>
     <w:p>
@@ -34,153 +54,438 @@
     <w:p>
       <w:pPr>
         <w:pStyle w:val="Heading1"/>
+        <w:jc w:val="left"/>
       </w:pPr>
       <w:r>
-        <w:t>1. Project Overview</w:t>
+        <w:t>1. Abstract &amp; Introduction</w:t>
       </w:r>
     </w:p>
     <w:p>
+      <w:pPr>
+        <w:jc w:val="left"/>
+      </w:pPr>
       <w:r>
-        <w:t>FlowMinds is an embodied interaction project that enables users to control presentations seamlessly and naturally using just a webcam and hand gestures. The project replaces traditional presentation remotes and keyboards with intuitive, computer-vision-based gesture recognition.</w:t>
+        <w:t>In the modern era of digital presentations, presenters often find themselves tethered to physical devices such as laptops, keyboards, or handheld clickers. FlowMinds was developed to bridge the gap between human kinetic expression and digital control, fulfilling the core principles of Embodied Interaction. By leveraging state-of-the-art Computer Vision (CV) algorithms and Machine Learning (ML) pipelines, FlowMinds allows users to control both native desktop presentations (e.g., PowerPoint, Keynote) and web-based PDF slides entirely through natural hand gestures captured by a standard webcam.</w:t>
+      </w:r>
+    </w:p>
+    <w:p>
+      <w:pPr>
+        <w:jc w:val="left"/>
+      </w:pPr>
+      <w:r>
+        <w:t>This document serves as the comprehensive technical reference for the FlowMinds project, detailing the mathematical algorithms behind gesture recognition, the dual-platform architecture (Web and Desktop), and the automated CI/CD pipelines that ensure continuous delivery.</w:t>
       </w:r>
     </w:p>
     <w:p>
       <w:pPr>
         <w:pStyle w:val="Heading1"/>
+        <w:jc w:val="left"/>
       </w:pPr>
       <w:r>
-        <w:t>2. Key Features and Gestures</w:t>
+        <w:t>2. System Architecture &amp; Monorepo Layout</w:t>
       </w:r>
     </w:p>
     <w:p>
+      <w:pPr>
+        <w:jc w:val="left"/>
+      </w:pPr>
       <w:r>
-        <w:t>The application recognizes specific hand gestures and maps them to presentation actions:</w:t>
+        <w:t>To ensure high maintainability and compliance with enterprise software standards, the project adopts a Monorepo architecture, cleanly separating the web application, the desktop application, and documentation into isolated domains.</w:t>
+      </w:r>
+    </w:p>
+    <w:p>
+      <w:pPr>
+        <w:pStyle w:val="Heading2"/>
+        <w:jc w:val="left"/>
+      </w:pPr>
+      <w:r>
+        <w:t>2.1 Web Environment (web/)</w:t>
+      </w:r>
+    </w:p>
+    <w:p>
+      <w:pPr>
+        <w:jc w:val="left"/>
+      </w:pPr>
+      <w:r>
+        <w:t>The web environment is built purely on HTML, CSS, and Vanilla JavaScript, ensuring zero-dependency overhead. The core of the web application relies on MediaPipe Tasks Vision, compiled to WebAssembly (WASM), allowing the neural network to execute fully client-side. This architectural decision guarantees user privacy (no video frames are sent to a server) and ultra-low latency.</w:t>
+      </w:r>
+    </w:p>
+    <w:p>
+      <w:pPr>
+        <w:jc w:val="left"/>
+      </w:pPr>
+      <w:r>
+        <w:t>Key sub-components include:</w:t>
       </w:r>
     </w:p>
     <w:p>
       <w:pPr>
         <w:pStyle w:val="ListBullet"/>
+        <w:jc w:val="left"/>
       </w:pPr>
       <w:r>
-        <w:t>• Next Slide: Open right hand (swipe right equivalent)</w:t>
+        <w:t>• UI &amp; Animations: Controlled via CSS variables and JavaScript Intersection Observers for scroll-reveals.</w:t>
       </w:r>
     </w:p>
     <w:p>
       <w:pPr>
         <w:pStyle w:val="ListBullet"/>
+        <w:jc w:val="left"/>
       </w:pPr>
       <w:r>
-        <w:t>• Previous Slide: Open left hand (swipe left equivalent)</w:t>
+        <w:t>• Presentation Engine: PDF.js is dynamically loaded to parse and render uploaded PDF files onto a canvas element.</w:t>
       </w:r>
     </w:p>
     <w:p>
       <w:pPr>
         <w:pStyle w:val="ListBullet"/>
+        <w:jc w:val="left"/>
       </w:pPr>
       <w:r>
-        <w:t>• Laser Pointer Toggle: Hold V-gesture for 1.5 seconds. Once active, the pointer follows the index finger.</w:t>
+        <w:t>• Configuration (config.js): A centralized module containing mutable constants like gesture cooldowns (actionCooldownMs) and gesture hold durations.</w:t>
+      </w:r>
+    </w:p>
+    <w:p>
+      <w:pPr>
+        <w:pStyle w:val="Heading2"/>
+        <w:jc w:val="left"/>
+      </w:pPr>
+      <w:r>
+        <w:t>2.2 Desktop Environment (src/)</w:t>
+      </w:r>
+    </w:p>
+    <w:p>
+      <w:pPr>
+        <w:jc w:val="left"/>
+      </w:pPr>
+      <w:r>
+        <w:t>The desktop environment is a native Python application designed to act as a bridge between computer vision and OS-level hardware interrupts.</w:t>
       </w:r>
     </w:p>
     <w:p>
       <w:pPr>
         <w:pStyle w:val="ListBullet"/>
+        <w:jc w:val="left"/>
       </w:pPr>
       <w:r>
-        <w:t>• Last Slide: Hold a fist for 4 seconds. This is disabled while the laser pointer is active to prevent accidental triggers.</w:t>
+        <w:t>• Perception Layer: OpenCV captures raw BGR frames from the hardware webcam and converts them to RGB.</w:t>
+      </w:r>
+    </w:p>
+    <w:p>
+      <w:pPr>
+        <w:pStyle w:val="ListBullet"/>
+        <w:jc w:val="left"/>
+      </w:pPr>
+      <w:r>
+        <w:t>• Inference Layer: The mediapipe Python package processes the RGB frames through the hand_landmarker.task model, extracting 21 spatial 3D coordinates per hand.</w:t>
+      </w:r>
+    </w:p>
+    <w:p>
+      <w:pPr>
+        <w:pStyle w:val="ListBullet"/>
+        <w:jc w:val="left"/>
+      </w:pPr>
+      <w:r>
+        <w:t>• Action Layer: PyAutoGUI intercepts the classified gestures and fires global OS keyboard events (e.g., ArrowRight, ArrowLeft), allowing the app to control any software running in the background.</w:t>
+      </w:r>
+    </w:p>
+    <w:p>
+      <w:r>
+        <w:br w:type="page"/>
       </w:r>
     </w:p>
     <w:p>
       <w:pPr>
         <w:pStyle w:val="Heading1"/>
+        <w:jc w:val="left"/>
       </w:pPr>
       <w:r>
-        <w:t>3. Project Architecture (Monorepo Standard)</w:t>
+        <w:t>3. Algorithmic Implementation</w:t>
       </w:r>
     </w:p>
     <w:p>
+      <w:pPr>
+        <w:jc w:val="left"/>
+      </w:pPr>
       <w:r>
-        <w:t>The project has been refactored into a modern 'Monorepo' layout, separating concerns between different environments and platforms. This structure ensures scalability, clean code practices, and efficient automated deployments.</w:t>
+        <w:t>The core logic of FlowMinds relies on deterministic spatial algorithms applied to the 21-point hand landmark topography generated by MediaPipe. Each landmark corresponds to a specific joint on the human hand. The origin (0) is the wrist, and the fingertips are located at indices 8 (Index), 12 (Middle), 16 (Ring), and 20 (Pinky).</w:t>
       </w:r>
     </w:p>
     <w:p>
       <w:pPr>
         <w:pStyle w:val="Heading2"/>
+        <w:jc w:val="left"/>
       </w:pPr>
       <w:r>
-        <w:t>3.1 Web Application (web/)</w:t>
+        <w:t>3.1 Finger State Analysis Algorithm</w:t>
       </w:r>
     </w:p>
     <w:p>
+      <w:pPr>
+        <w:jc w:val="left"/>
+      </w:pPr>
       <w:r>
-        <w:t>A responsive, client-side web application built using HTML, CSS, and Vanilla JavaScript. It utilizes Google's MediaPipe Tasks Vision (WASM) to run the AI model directly in the browser, ensuring data privacy and low latency. The web app includes an integrated PDF.js renderer, allowing users to upload and present PDF slides natively inside the browser.</w:t>
+        <w:t>To determine if a specific finger is 'open' or 'closed', the system compares the Y-coordinate of the fingertip to the Y-coordinate of its corresponding lower knuckle (PIP joint). Since the Y-axis increases downwards in image coordinates, a finger is considered OPEN if its tip is geometrically HIGHER (less than) its knuckle.</w:t>
+      </w:r>
+    </w:p>
+    <w:p>
+      <w:pPr>
+        <w:jc w:val="left"/>
+      </w:pPr>
+      <w:r>
+        <w:t>Algorithm logic for detecting an open hand (Swipe Gestures):</w:t>
+      </w:r>
+    </w:p>
+    <w:p>
+      <w:pPr>
+        <w:jc w:val="left"/>
+      </w:pPr>
+      <w:r>
+        <w:t>1. Define tip indices: [8, 12, 16, 20]</w:t>
+      </w:r>
+    </w:p>
+    <w:p>
+      <w:pPr>
+        <w:jc w:val="left"/>
+      </w:pPr>
+      <w:r>
+        <w:t>2. Define mid-joint indices: [6, 10, 14, 18]</w:t>
+      </w:r>
+    </w:p>
+    <w:p>
+      <w:pPr>
+        <w:jc w:val="left"/>
+      </w:pPr>
+      <w:r>
+        <w:t>3. Condition: For each i in [0..3], check if landmark[tips[i]].y &lt; landmark[mids[i]].y</w:t>
+      </w:r>
+    </w:p>
+    <w:p>
+      <w:pPr>
+        <w:jc w:val="left"/>
+      </w:pPr>
+      <w:r>
+        <w:t>If all conditions evaluate to True, the hand is fully open. The system then evaluates the X-coordinate of the thumb (landmark 4) relative to the index finger (landmark 8) to differentiate between the Right Hand (Next Slide) and Left Hand (Previous Slide).</w:t>
       </w:r>
     </w:p>
     <w:p>
       <w:pPr>
         <w:pStyle w:val="Heading2"/>
+        <w:jc w:val="left"/>
       </w:pPr>
       <w:r>
-        <w:t>3.2 Python Desktop Application (src/)</w:t>
+        <w:t>3.2 The V-Gesture (Laser Pointer Toggle)</w:t>
       </w:r>
     </w:p>
     <w:p>
+      <w:pPr>
+        <w:jc w:val="left"/>
+      </w:pPr>
       <w:r>
-        <w:t>A standalone desktop application designed for macOS and Windows. It utilizes OpenCV for video capture, MediaPipe for hand landmark detection, and PyAutoGUI to simulate global keyboard and mouse events. This allows the app to control any presentation software (like PowerPoint or Keynote) running on the operating system.</w:t>
+        <w:t>The V-Gesture is utilized to toggle the virtual laser pointer. The mathematical constraints for this gesture are highly specific to avoid false positives:</w:t>
+      </w:r>
+    </w:p>
+    <w:p>
+      <w:pPr>
+        <w:pStyle w:val="ListBullet"/>
+        <w:jc w:val="left"/>
+      </w:pPr>
+      <w:r>
+        <w:t>• Index Finger: OPEN (lm[8].y &lt; lm[6].y)</w:t>
+      </w:r>
+    </w:p>
+    <w:p>
+      <w:pPr>
+        <w:pStyle w:val="ListBullet"/>
+        <w:jc w:val="left"/>
+      </w:pPr>
+      <w:r>
+        <w:t>• Middle Finger: OPEN (lm[12].y &lt; lm[10].y)</w:t>
+      </w:r>
+    </w:p>
+    <w:p>
+      <w:pPr>
+        <w:pStyle w:val="ListBullet"/>
+        <w:jc w:val="left"/>
+      </w:pPr>
+      <w:r>
+        <w:t>• Ring Finger: CLOSED (lm[16].y &gt; lm[14].y)</w:t>
+      </w:r>
+    </w:p>
+    <w:p>
+      <w:pPr>
+        <w:pStyle w:val="ListBullet"/>
+        <w:jc w:val="left"/>
+      </w:pPr>
+      <w:r>
+        <w:t>• Pinky Finger: CLOSED (lm[20].y &gt; lm[18].y)</w:t>
       </w:r>
     </w:p>
     <w:p>
       <w:pPr>
         <w:pStyle w:val="Heading2"/>
+        <w:jc w:val="left"/>
       </w:pPr>
       <w:r>
-        <w:t>3.3 Documentation (docs/)</w:t>
+        <w:t>3.3 State Machine and Temporal Holds</w:t>
+      </w:r>
+    </w:p>
+    <w:p>
+      <w:pPr>
+        <w:jc w:val="left"/>
+      </w:pPr>
+      <w:r>
+        <w:t>Certain actions are destructive or highly disruptive (e.g., jumping to the last slide, toggling the laser). To prevent accidental triggers from momentary hand spasms, the system implements a Temporal State Machine.</w:t>
+      </w:r>
+    </w:p>
+    <w:p>
+      <w:pPr>
+        <w:jc w:val="left"/>
+      </w:pPr>
+      <w:r>
+        <w:t>When a gesture like a 'Fist' (all tips &gt; mids) is detected, the system records a timestamp (fistGestureStartTime). On every subsequent frame, it calculates the elapsed time (Δt). Only when Δt exceeds a predefined threshold (e.g., 4000ms), does the state machine transition and trigger the action. If the gesture is broken at any point before the threshold, the timer instantly resets to 0.</w:t>
+      </w:r>
+    </w:p>
+    <w:p>
+      <w:pPr>
+        <w:pStyle w:val="Heading2"/>
+        <w:jc w:val="left"/>
+      </w:pPr>
+      <w:r>
+        <w:t>3.4 Laser Pointer Kinematics</w:t>
+      </w:r>
+    </w:p>
+    <w:p>
+      <w:pPr>
+        <w:jc w:val="left"/>
+      </w:pPr>
+      <w:r>
+        <w:t>When the laser pointer state is active, the system extracts the normalized coordinates (x, y) of the index fingertip (landmark 8). Because webcams mirror the user horizontally (for natural UX), the X-coordinate is inverted using the formula: Real_X = (1 - lm[8].x) * Container_Width. This mapped coordinate is then used to dynamically translate an absolute HTML DOM element (the laser dot) over the presentation canvas.</w:t>
       </w:r>
     </w:p>
     <w:p>
       <w:r>
-        <w:t>Contains all academic and presentation materials (PDFs, PPTXs) associated with the project.</w:t>
+        <w:br w:type="page"/>
       </w:r>
     </w:p>
     <w:p>
       <w:pPr>
         <w:pStyle w:val="Heading1"/>
+        <w:jc w:val="left"/>
       </w:pPr>
       <w:r>
-        <w:t>4. Continuous Integration &amp; Deployment (CI/CD)</w:t>
+        <w:t>4. Continuous Integration &amp; Continuous Deployment (CI/CD)</w:t>
       </w:r>
     </w:p>
     <w:p>
+      <w:pPr>
+        <w:jc w:val="left"/>
+      </w:pPr>
       <w:r>
-        <w:t>The project utilizes GitHub Actions to fully automate building and deployment:</w:t>
+        <w:t>FlowMinds utilizes advanced GitHub Actions workflows to guarantee that code changes are continuously tested, compiled, and deployed without human intervention.</w:t>
+      </w:r>
+    </w:p>
+    <w:p>
+      <w:pPr>
+        <w:pStyle w:val="Heading2"/>
+        <w:jc w:val="left"/>
+      </w:pPr>
+      <w:r>
+        <w:t>4.1 Web Deployment Pipeline (static.yml)</w:t>
+      </w:r>
+    </w:p>
+    <w:p>
+      <w:pPr>
+        <w:jc w:val="left"/>
+      </w:pPr>
+      <w:r>
+        <w:t>The static web deployment pipeline runs entirely in the cloud. Upon a push to the `main` branch, the workflow checks out the repository and specifically targets the `web/` directory. It packages the client-side JavaScript, CSS, and HTML into a GitHub Pages artifact. This guarantees that the live website remains lightweight and is not polluted with Python backend code.</w:t>
+      </w:r>
+    </w:p>
+    <w:p>
+      <w:pPr>
+        <w:pStyle w:val="Heading2"/>
+        <w:jc w:val="left"/>
+      </w:pPr>
+      <w:r>
+        <w:t>4.2 Multi-OS Desktop Compilation (build.yml)</w:t>
+      </w:r>
+    </w:p>
+    <w:p>
+      <w:pPr>
+        <w:jc w:val="left"/>
+      </w:pPr>
+      <w:r>
+        <w:t>Deploying Python desktop applications natively requires OS-specific compilation. The `build.yml` workflow utilizes a GitHub Actions Matrix Strategy to spin up both `ubuntu-latest` (for potential linux builds), `macos-latest`, and `windows-latest` virtual machines concurrently.</w:t>
+      </w:r>
+    </w:p>
+    <w:p>
+      <w:pPr>
+        <w:jc w:val="left"/>
+      </w:pPr>
+      <w:r>
+        <w:t>The pipeline executes the following sequence on each VM:</w:t>
       </w:r>
     </w:p>
     <w:p>
       <w:pPr>
         <w:pStyle w:val="ListBullet"/>
+        <w:jc w:val="left"/>
       </w:pPr>
       <w:r>
-        <w:t>• GitHub Pages Deployment: Any push to the main branch triggers a workflow (static.yml) that automatically deploys the contents of the web/ directory to GitHub Pages.</w:t>
+        <w:t>1. Setup Python 3.11 environment.</w:t>
       </w:r>
     </w:p>
     <w:p>
       <w:pPr>
         <w:pStyle w:val="ListBullet"/>
+        <w:jc w:val="left"/>
       </w:pPr>
       <w:r>
-        <w:t>• Automated Desktop Builds: The build.yml workflow automatically compiles the Python application using PyInstaller for both Windows and macOS, generating standalone executables whenever changes are pushed.</w:t>
+        <w:t>2. Navigate into the `src/` directory and install runtime dependencies.</w:t>
+      </w:r>
+    </w:p>
+    <w:p>
+      <w:pPr>
+        <w:pStyle w:val="ListBullet"/>
+        <w:jc w:val="left"/>
+      </w:pPr>
+      <w:r>
+        <w:t>3. Invoke PyInstaller using the customized `gestures.spec` file, which bundles the Python interpreter, OpenCV binaries, and the MediaPipe task models into a single, standalone executable.</w:t>
+      </w:r>
+    </w:p>
+    <w:p>
+      <w:pPr>
+        <w:pStyle w:val="ListBullet"/>
+        <w:jc w:val="left"/>
+      </w:pPr>
+      <w:r>
+        <w:t>4. Compress the output artifacts and upload them to the GitHub run, allowing end-users to download a plug-and-play version of the software without needing Python installed on their local machines.</w:t>
       </w:r>
     </w:p>
     <w:p>
       <w:pPr>
         <w:pStyle w:val="Heading1"/>
+        <w:jc w:val="left"/>
       </w:pPr>
       <w:r>
-        <w:t>5. Future Enhancements</w:t>
+        <w:t>5. Conclusion and Future Work</w:t>
       </w:r>
     </w:p>
     <w:p>
+      <w:pPr>
+        <w:jc w:val="left"/>
+      </w:pPr>
       <w:r>
-        <w:t>Future iterations of FlowMinds aim to integrate more complex dynamic gestures (e.g., pinch-to-zoom for highlighting specific slide areas) and provide a custom configuration interface allowing users to map specific gestures to arbitrary keyboard shortcuts.</w:t>
+        <w:t>FlowMinds successfully proves the viability of using standard RGB webcams for high-precision, low-latency spatial interactions. By completely decoupling the presentation layer from the algorithmic backend, the project achieves an incredibly robust and scalable architecture.</w:t>
+      </w:r>
+    </w:p>
+    <w:p>
+      <w:pPr>
+        <w:jc w:val="left"/>
+      </w:pPr>
+      <w:r>
+        <w:t>Future iterations will explore integrating Dynamic Time Warping (DTW) algorithms to detect temporal gestures (e.g., drawing shapes in the air) and expanding the web application to support WebRTC for remote, cross-device presentation control.</w:t>
       </w:r>
     </w:p>
     <w:sectPr>
@@ -557,7 +862,8 @@
     <w:qFormat/>
     <w:rsid w:val="00FC693F"/>
     <w:rPr>
-      <w:sz w:val="28"/>
+      <w:b/>
+      <w:sz w:val="24"/>
     </w:rPr>
   </w:style>
   <w:style w:type="paragraph" w:styleId="Header">

</xml_diff>

<commit_message>
docs: regenerate docx to match the detailed markdown structure
</commit_message>
<xml_diff>
--- a/docs/FlowMinds_Documentation.docx
+++ b/docs/FlowMinds_Documentation.docx
@@ -8,42 +8,174 @@
         <w:jc w:val="center"/>
       </w:pPr>
       <w:r>
-        <w:t>FlowMinds</w:t>
-        <w:br/>
-        <w:t>Hand Gesture Presentation Control</w:t>
+        <w:t>FlowMinds Technical Documentation</w:t>
       </w:r>
     </w:p>
     <w:p>
-      <w:pPr>
-        <w:jc w:val="center"/>
-      </w:pPr>
       <w:r>
-        <w:t>Comprehensive Technical &amp; Algorithmic Documentation</w:t>
-      </w:r>
-    </w:p>
-    <w:p>
-      <w:pPr>
-        <w:jc w:val="left"/>
-      </w:pPr>
-      <w:r>
-        <w:br/>
-        <w:br/>
-        <w:br/>
-        <w:br/>
-        <w:br/>
         <w:br/>
       </w:r>
     </w:p>
     <w:p>
       <w:pPr>
-        <w:jc w:val="center"/>
+        <w:pStyle w:val="Heading1"/>
       </w:pPr>
       <w:r>
-        <w:t>Course: Embodied Interaction (SS2026)</w:t>
+        <w:t>1. Overview</w:t>
+      </w:r>
+    </w:p>
+    <w:p>
+      <w:r>
+        <w:t>FlowMinds is an embodied interaction system designed to seamlessly bridge the gap between human kinetic expression and digital control. Built for the Embodied Interaction (SS2026) course, the project replaces traditional presentation remotes and keyboards with intuitive, computer-vision-based gesture recognition. It allows users to control both native desktop presentations (e.g., PowerPoint, Keynote) and web-based PDF slides entirely through natural hand gestures captured by a standard webcam.</w:t>
+      </w:r>
+    </w:p>
+    <w:p>
+      <w:pPr>
+        <w:pStyle w:val="Heading1"/>
+      </w:pPr>
+      <w:r>
+        <w:t>2. Architecture / Pipeline</w:t>
+      </w:r>
+    </w:p>
+    <w:p>
+      <w:r>
+        <w:t>The system adopts a Monorepo architecture, clearly separating the client-side web application (web/) and the native desktop application (src/). The core data flow for the gesture recognition pipeline is as follows:</w:t>
+      </w:r>
+    </w:p>
+    <w:p>
+      <w:pPr>
+        <w:ind w:left="720"/>
+      </w:pPr>
+      <w:r>
+        <w:t xml:space="preserve">[Webcam Hardware] </w:t>
         <w:br/>
-        <w:t>Authors: Bashar Haidar &amp; Lana Kara Mohammed</w:t>
+        <w:t xml:space="preserve">       │</w:t>
         <w:br/>
-        <w:t>Version: 2.0 (Monorepo Architecture)</w:t>
+        <w:t xml:space="preserve">       ▼</w:t>
+        <w:br/>
+        <w:t>[OpenCV Capture / Browser MediaDevices API] (Extracts raw video frames)</w:t>
+        <w:br/>
+        <w:t xml:space="preserve">       │</w:t>
+        <w:br/>
+        <w:t xml:space="preserve">       ▼</w:t>
+        <w:br/>
+        <w:t>[MediaPipe HandLandmarker] (Async/Live-stream inference yielding 21 3D landmarks)</w:t>
+        <w:br/>
+        <w:t xml:space="preserve">       │</w:t>
+        <w:br/>
+        <w:t xml:space="preserve">       ▼</w:t>
+        <w:br/>
+        <w:t>[Gesture Classification Logic] (Mathematical evaluation of landmarks &amp; state machines)</w:t>
+        <w:br/>
+        <w:t xml:space="preserve">       │</w:t>
+        <w:br/>
+        <w:t xml:space="preserve">       ▼</w:t>
+        <w:br/>
+        <w:t>[Action Dispatcher] (PyAutoGUI in Desktop / DOM Manipulation in Web)</w:t>
+      </w:r>
+    </w:p>
+    <w:p>
+      <w:pPr>
+        <w:pStyle w:val="Heading1"/>
+      </w:pPr>
+      <w:r>
+        <w:t>3. Requirements</w:t>
+      </w:r>
+    </w:p>
+    <w:p>
+      <w:r>
+        <w:t>To run the Desktop Application (src/) locally or build it from source, the following precise environment is required:</w:t>
+      </w:r>
+    </w:p>
+    <w:p>
+      <w:pPr>
+        <w:pStyle w:val="ListBullet"/>
+      </w:pPr>
+      <w:r>
+        <w:t>• OS: Windows 10/11 or macOS 10.15+</w:t>
+      </w:r>
+    </w:p>
+    <w:p>
+      <w:pPr>
+        <w:pStyle w:val="ListBullet"/>
+      </w:pPr>
+      <w:r>
+        <w:t>• Python: Version 3.11.x</w:t>
+      </w:r>
+    </w:p>
+    <w:p>
+      <w:pPr>
+        <w:pStyle w:val="ListBullet"/>
+      </w:pPr>
+      <w:r>
+        <w:t>• Libraries &amp; Dependencies:</w:t>
+      </w:r>
+    </w:p>
+    <w:p>
+      <w:r>
+        <w:t xml:space="preserve">  - opencv-python (v4.8.x+)</w:t>
+      </w:r>
+    </w:p>
+    <w:p>
+      <w:r>
+        <w:t xml:space="preserve">  - mediapipe (v0.10.8+)</w:t>
+      </w:r>
+    </w:p>
+    <w:p>
+      <w:r>
+        <w:t xml:space="preserve">  - PyAutoGUI (v0.9.54+)</w:t>
+      </w:r>
+    </w:p>
+    <w:p>
+      <w:r>
+        <w:t xml:space="preserve">  - pyinstaller (v6.3.0+)</w:t>
+      </w:r>
+    </w:p>
+    <w:p>
+      <w:pPr>
+        <w:pStyle w:val="Heading1"/>
+      </w:pPr>
+      <w:r>
+        <w:t>4. Installation</w:t>
+      </w:r>
+    </w:p>
+    <w:p>
+      <w:r>
+        <w:t>Follow these step-by-step instructions to run the Python Desktop application locally.</w:t>
+      </w:r>
+    </w:p>
+    <w:p>
+      <w:pPr>
+        <w:ind w:left="720"/>
+      </w:pPr>
+      <w:r>
+        <w:t># 1. Clone the repository</w:t>
+        <w:br/>
+        <w:t>git clone https://github.com/basharhaidar98/hand-gesture-presentation-control-FlowMinds.git</w:t>
+        <w:br/>
+        <w:t>cd hand-gesture-presentation-control-FlowMinds</w:t>
+        <w:br/>
+        <w:br/>
+        <w:t># 2. Navigate to the desktop app source code</w:t>
+        <w:br/>
+        <w:t>cd src</w:t>
+        <w:br/>
+        <w:br/>
+        <w:t># 3. Create and activate a virtual environment (Recommended)</w:t>
+        <w:br/>
+        <w:t>python3 -m venv venv</w:t>
+        <w:br/>
+        <w:t>source venv/bin/activate  # On Windows use: venv\Scripts\activate</w:t>
+        <w:br/>
+        <w:br/>
+        <w:t># 4. Install required dependencies</w:t>
+        <w:br/>
+        <w:t>pip install opencv-python mediapipe pyautogui pyinstaller</w:t>
+        <w:br/>
+        <w:br/>
+        <w:t># 5. Run the application</w:t>
+        <w:br/>
+        <w:t>python gestures.py</w:t>
       </w:r>
     </w:p>
     <w:p>
@@ -54,438 +186,418 @@
     <w:p>
       <w:pPr>
         <w:pStyle w:val="Heading1"/>
-        <w:jc w:val="left"/>
       </w:pPr>
       <w:r>
-        <w:t>1. Abstract &amp; Introduction</w:t>
+        <w:t>5. Gesture Reference Table</w:t>
+      </w:r>
+    </w:p>
+    <w:p>
+      <w:r>
+        <w:t>The following table maps the supported physical hand gestures to their corresponding digital actions and details the mathematical landmark constraints used for classification.</w:t>
+      </w:r>
+    </w:p>
+    <w:tbl>
+      <w:tblPr>
+        <w:tblStyle w:val="TableGrid"/>
+        <w:tblW w:type="auto" w:w="0"/>
+        <w:tblLook w:firstColumn="1" w:firstRow="1" w:lastColumn="0" w:lastRow="0" w:noHBand="0" w:noVBand="1" w:val="04A0"/>
+      </w:tblPr>
+      <w:tblGrid>
+        <w:gridCol w:w="2880"/>
+        <w:gridCol w:w="2880"/>
+        <w:gridCol w:w="2880"/>
+      </w:tblGrid>
+      <w:tr>
+        <w:tc>
+          <w:tcPr>
+            <w:tcW w:type="dxa" w:w="2880"/>
+          </w:tcPr>
+          <w:p>
+            <w:r>
+              <w:t>Gesture</w:t>
+            </w:r>
+          </w:p>
+        </w:tc>
+        <w:tc>
+          <w:tcPr>
+            <w:tcW w:type="dxa" w:w="2880"/>
+          </w:tcPr>
+          <w:p>
+            <w:r>
+              <w:t>Action</w:t>
+            </w:r>
+          </w:p>
+        </w:tc>
+        <w:tc>
+          <w:tcPr>
+            <w:tcW w:type="dxa" w:w="2880"/>
+          </w:tcPr>
+          <w:p>
+            <w:r>
+              <w:t>Landmark Points &amp; Logic Constraints</w:t>
+            </w:r>
+          </w:p>
+        </w:tc>
+      </w:tr>
+      <w:tr>
+        <w:tc>
+          <w:tcPr>
+            <w:tcW w:type="dxa" w:w="2880"/>
+          </w:tcPr>
+          <w:p>
+            <w:r>
+              <w:t>Open Right Hand</w:t>
+            </w:r>
+          </w:p>
+        </w:tc>
+        <w:tc>
+          <w:tcPr>
+            <w:tcW w:type="dxa" w:w="2880"/>
+          </w:tcPr>
+          <w:p>
+            <w:r>
+              <w:t>Next Slide</w:t>
+            </w:r>
+          </w:p>
+        </w:tc>
+        <w:tc>
+          <w:tcPr>
+            <w:tcW w:type="dxa" w:w="2880"/>
+          </w:tcPr>
+          <w:p>
+            <w:r>
+              <w:t>Tips [8, 12, 16, 20] &lt; Mids [6, 10, 14, 18] (Y-axis) AND lm[4].x &lt; lm[8].x</w:t>
+            </w:r>
+          </w:p>
+        </w:tc>
+      </w:tr>
+      <w:tr>
+        <w:tc>
+          <w:tcPr>
+            <w:tcW w:type="dxa" w:w="2880"/>
+          </w:tcPr>
+          <w:p>
+            <w:r>
+              <w:t>Open Left Hand</w:t>
+            </w:r>
+          </w:p>
+        </w:tc>
+        <w:tc>
+          <w:tcPr>
+            <w:tcW w:type="dxa" w:w="2880"/>
+          </w:tcPr>
+          <w:p>
+            <w:r>
+              <w:t>Previous Slide</w:t>
+            </w:r>
+          </w:p>
+        </w:tc>
+        <w:tc>
+          <w:tcPr>
+            <w:tcW w:type="dxa" w:w="2880"/>
+          </w:tcPr>
+          <w:p>
+            <w:r>
+              <w:t>Tips [8, 12, 16, 20] &lt; Mids [6, 10, 14, 18] (Y-axis) AND lm[4].x &gt; lm[8].x</w:t>
+            </w:r>
+          </w:p>
+        </w:tc>
+      </w:tr>
+      <w:tr>
+        <w:tc>
+          <w:tcPr>
+            <w:tcW w:type="dxa" w:w="2880"/>
+          </w:tcPr>
+          <w:p>
+            <w:r>
+              <w:t>V-Gesture (Hold)</w:t>
+            </w:r>
+          </w:p>
+        </w:tc>
+        <w:tc>
+          <w:tcPr>
+            <w:tcW w:type="dxa" w:w="2880"/>
+          </w:tcPr>
+          <w:p>
+            <w:r>
+              <w:t>Toggle Laser Pointer</w:t>
+            </w:r>
+          </w:p>
+        </w:tc>
+        <w:tc>
+          <w:tcPr>
+            <w:tcW w:type="dxa" w:w="2880"/>
+          </w:tcPr>
+          <w:p>
+            <w:r>
+              <w:t>Index &amp; Middle OPEN (tip &lt; mid), Ring &amp; Pinky CLOSED (tip &gt; mid). Held for 1.5s.</w:t>
+            </w:r>
+          </w:p>
+        </w:tc>
+      </w:tr>
+      <w:tr>
+        <w:tc>
+          <w:tcPr>
+            <w:tcW w:type="dxa" w:w="2880"/>
+          </w:tcPr>
+          <w:p>
+            <w:r>
+              <w:t>Index Pointing</w:t>
+            </w:r>
+          </w:p>
+        </w:tc>
+        <w:tc>
+          <w:tcPr>
+            <w:tcW w:type="dxa" w:w="2880"/>
+          </w:tcPr>
+          <w:p>
+            <w:r>
+              <w:t>Move Laser Pointer</w:t>
+            </w:r>
+          </w:p>
+        </w:tc>
+        <w:tc>
+          <w:tcPr>
+            <w:tcW w:type="dxa" w:w="2880"/>
+          </w:tcPr>
+          <w:p>
+            <w:r>
+              <w:t>Executed only when Laser is active. Tracks lm[8] (Index tip) across screen.</w:t>
+            </w:r>
+          </w:p>
+        </w:tc>
+      </w:tr>
+      <w:tr>
+        <w:tc>
+          <w:tcPr>
+            <w:tcW w:type="dxa" w:w="2880"/>
+          </w:tcPr>
+          <w:p>
+            <w:r>
+              <w:t>Fist (Hold)</w:t>
+            </w:r>
+          </w:p>
+        </w:tc>
+        <w:tc>
+          <w:tcPr>
+            <w:tcW w:type="dxa" w:w="2880"/>
+          </w:tcPr>
+          <w:p>
+            <w:r>
+              <w:t>Jump to Last Slide</w:t>
+            </w:r>
+          </w:p>
+        </w:tc>
+        <w:tc>
+          <w:tcPr>
+            <w:tcW w:type="dxa" w:w="2880"/>
+          </w:tcPr>
+          <w:p>
+            <w:r>
+              <w:t>Tips [8, 12, 16, 20] &gt; Mids [6, 10, 14, 18] (Y-axis). Held for 4.0s.</w:t>
+            </w:r>
+          </w:p>
+        </w:tc>
+      </w:tr>
+    </w:tbl>
+    <w:p>
+      <w:pPr>
+        <w:pStyle w:val="Heading1"/>
+      </w:pPr>
+      <w:r>
+        <w:t>6. Conflict Resolution Logic</w:t>
+      </w:r>
+    </w:p>
+    <w:p>
+      <w:r>
+        <w:t>Handling multiple concurrent gestures requires robust 'Conflict Guards' to ensure deterministic behavior and prevent erratic UX.</w:t>
       </w:r>
     </w:p>
     <w:p>
       <w:pPr>
-        <w:jc w:val="left"/>
+        <w:pStyle w:val="ListBullet"/>
       </w:pPr>
       <w:r>
-        <w:t>In the modern era of digital presentations, presenters often find themselves tethered to physical devices such as laptops, keyboards, or handheld clickers. FlowMinds was developed to bridge the gap between human kinetic expression and digital control, fulfilling the core principles of Embodied Interaction. By leveraging state-of-the-art Computer Vision (CV) algorithms and Machine Learning (ML) pipelines, FlowMinds allows users to control both native desktop presentations (e.g., PowerPoint, Keynote) and web-based PDF slides entirely through natural hand gestures captured by a standard webcam.</w:t>
+        <w:t>• Fist vs. Laser Conflict Guard: A conditional guard `if (isFist(lm) &amp;&amp; !laserActive)` was introduced. This ensures that if the laser pointer is currently active, curling the hand into a fist (either to turn off the laser or accidentally) will completely bypass the 'Fist -&gt; Last Slide' state machine.</w:t>
       </w:r>
     </w:p>
     <w:p>
       <w:pPr>
-        <w:jc w:val="left"/>
+        <w:pStyle w:val="ListBullet"/>
       </w:pPr>
       <w:r>
-        <w:t>This document serves as the comprehensive technical reference for the FlowMinds project, detailing the mathematical algorithms behind gesture recognition, the dual-platform architecture (Web and Desktop), and the automated CI/CD pipelines that ensure continuous delivery.</w:t>
+        <w:t>• V-Gesture vs. Swipe Guard: The V-gesture logic actively verifies that the Ring and Pinky fingers are strictly closed (`lm[16].y &gt; lm[14].y`). This prevents an open hand (Swipe) from being misclassified as a V-Gesture when the hand is angled.</w:t>
       </w:r>
     </w:p>
     <w:p>
       <w:pPr>
         <w:pStyle w:val="Heading1"/>
-        <w:jc w:val="left"/>
       </w:pPr>
       <w:r>
-        <w:t>2. System Architecture &amp; Monorepo Layout</w:t>
-      </w:r>
-    </w:p>
-    <w:p>
-      <w:pPr>
-        <w:jc w:val="left"/>
-      </w:pPr>
-      <w:r>
-        <w:t>To ensure high maintainability and compliance with enterprise software standards, the project adopts a Monorepo architecture, cleanly separating the web application, the desktop application, and documentation into isolated domains.</w:t>
+        <w:t>7. Known Issues &amp; Solutions</w:t>
       </w:r>
     </w:p>
     <w:p>
       <w:pPr>
         <w:pStyle w:val="Heading2"/>
-        <w:jc w:val="left"/>
       </w:pPr>
       <w:r>
-        <w:t>2.1 Web Environment (web/)</w:t>
-      </w:r>
-    </w:p>
-    <w:p>
-      <w:pPr>
-        <w:jc w:val="left"/>
-      </w:pPr>
-      <w:r>
-        <w:t>The web environment is built purely on HTML, CSS, and Vanilla JavaScript, ensuring zero-dependency overhead. The core of the web application relies on MediaPipe Tasks Vision, compiled to WebAssembly (WASM), allowing the neural network to execute fully client-side. This architectural decision guarantees user privacy (no video frames are sent to a server) and ultra-low latency.</w:t>
-      </w:r>
-    </w:p>
-    <w:p>
-      <w:pPr>
-        <w:jc w:val="left"/>
-      </w:pPr>
-      <w:r>
-        <w:t>Key sub-components include:</w:t>
+        <w:t>Issue 1: Accidental Triggering of the Fist Gesture</w:t>
       </w:r>
     </w:p>
     <w:p>
       <w:pPr>
         <w:pStyle w:val="ListBullet"/>
-        <w:jc w:val="left"/>
       </w:pPr>
       <w:r>
-        <w:t>• UI &amp; Animations: Controlled via CSS variables and JavaScript Intersection Observers for scroll-reveals.</w:t>
+        <w:t>• Problem: Momentary hand spasms or transitioning between open/closed states briefly matched the Fist gesture constraints, causing the presentation to jump erratically to the last slide.</w:t>
       </w:r>
     </w:p>
     <w:p>
       <w:pPr>
         <w:pStyle w:val="ListBullet"/>
-        <w:jc w:val="left"/>
       </w:pPr>
       <w:r>
-        <w:t>• Presentation Engine: PDF.js is dynamically loaded to parse and render uploaded PDF files onto a canvas element.</w:t>
+        <w:t>• Solution: Implemented a Temporal State Machine (Hold Timer) with a 4.0-second threshold. A `fistGestureStartTime` variable tracks the initial detection timestamp. The system evaluates Δt continuously and renders a countdown timer on the UI. If the gesture is broken before Δt &gt; 4000ms, the timer resets instantly.</w:t>
+      </w:r>
+    </w:p>
+    <w:p>
+      <w:pPr>
+        <w:pStyle w:val="Heading2"/>
+      </w:pPr>
+      <w:r>
+        <w:t>Issue 2: Unstable Laser Pointer Activation via Swipe</w:t>
       </w:r>
     </w:p>
     <w:p>
       <w:pPr>
         <w:pStyle w:val="ListBullet"/>
-        <w:jc w:val="left"/>
       </w:pPr>
       <w:r>
-        <w:t>• Configuration (config.js): A centralized module containing mutable constants like gesture cooldowns (actionCooldownMs) and gesture hold durations.</w:t>
-      </w:r>
-    </w:p>
-    <w:p>
-      <w:pPr>
-        <w:pStyle w:val="Heading2"/>
-        <w:jc w:val="left"/>
-      </w:pPr>
-      <w:r>
-        <w:t>2.2 Desktop Environment (src/)</w:t>
-      </w:r>
-    </w:p>
-    <w:p>
-      <w:pPr>
-        <w:jc w:val="left"/>
-      </w:pPr>
-      <w:r>
-        <w:t>The desktop environment is a native Python application designed to act as a bridge between computer vision and OS-level hardware interrupts.</w:t>
+        <w:t>• Problem: Originally, a swipe gesture was utilized to toggle the laser pointer. This proved highly unstable as standard slide-switching swipes frequently triggered the laser, causing massive conflicts. Additionally, a legacy 'Pen Mode' (Stift) compounded the interference.</w:t>
       </w:r>
     </w:p>
     <w:p>
       <w:pPr>
         <w:pStyle w:val="ListBullet"/>
-        <w:jc w:val="left"/>
       </w:pPr>
       <w:r>
-        <w:t>• Perception Layer: OpenCV captures raw BGR frames from the hardware webcam and converts them to RGB.</w:t>
+        <w:t>• Solution: The swipe toggle and legacy Pen Mode were completely deprecated. A dedicated V-Gesture (Peace Sign) was introduced solely for toggling the laser. This gesture is mechanically distinct from an open hand, drastically reducing false positives.</w:t>
+      </w:r>
+    </w:p>
+    <w:p>
+      <w:pPr>
+        <w:pStyle w:val="Heading1"/>
+      </w:pPr>
+      <w:r>
+        <w:t>8. Configuration Parameters</w:t>
+      </w:r>
+    </w:p>
+    <w:p>
+      <w:r>
+        <w:t>Key threshold values and configurations have been externalized into a dedicated configuration file (web/js/config.js) for rapid adjustment without digging through core logic.</w:t>
+      </w:r>
+    </w:p>
+    <w:p>
+      <w:pPr>
+        <w:ind w:left="720"/>
+      </w:pPr>
+      <w:r>
+        <w:t>const CONFIG = {</w:t>
+        <w:br/>
+        <w:t xml:space="preserve">  // Cooldown between slide transitions to prevent rapid double-skips</w:t>
+        <w:br/>
+        <w:t xml:space="preserve">  actionCooldownMs: 1200,</w:t>
+        <w:br/>
+        <w:br/>
+        <w:t xml:space="preserve">  // Hold duration for jumping to the last slide</w:t>
+        <w:br/>
+        <w:t xml:space="preserve">  fistHoldDurationMs: 4000,</w:t>
+        <w:br/>
+        <w:br/>
+        <w:t xml:space="preserve">  // Hold duration to toggle the laser pointer</w:t>
+        <w:br/>
+        <w:t xml:space="preserve">  vGestureHoldDurationMs: 1500,</w:t>
+        <w:br/>
+        <w:br/>
+        <w:t xml:space="preserve">  // PDF.js crisp rendering scales for normal vs full-screen modes</w:t>
+        <w:br/>
+        <w:t xml:space="preserve">  pdfNormalScale: 1.2,</w:t>
+        <w:br/>
+        <w:t xml:space="preserve">  pdfFullscreenScale: 2.2,</w:t>
+        <w:br/>
+        <w:t xml:space="preserve">  </w:t>
+        <w:br/>
+        <w:t xml:space="preserve">  // Total default slides in the HTML demo</w:t>
+        <w:br/>
+        <w:t xml:space="preserve">  totalDemoSlides: 5</w:t>
+        <w:br/>
+        <w:t>};</w:t>
+      </w:r>
+    </w:p>
+    <w:p>
+      <w:pPr>
+        <w:pStyle w:val="Heading1"/>
+      </w:pPr>
+      <w:r>
+        <w:t>9. Future Improvements</w:t>
       </w:r>
     </w:p>
     <w:p>
       <w:pPr>
         <w:pStyle w:val="ListBullet"/>
-        <w:jc w:val="left"/>
       </w:pPr>
       <w:r>
-        <w:t>• Inference Layer: The mediapipe Python package processes the RGB frames through the hand_landmarker.task model, extracting 21 spatial 3D coordinates per hand.</w:t>
+        <w:t>• Dynamic Time Warping (DTW): Implement sequence-based gesture recognition to allow users to draw specific shapes (e.g., circles to highlight areas) rather than relying purely on static poses.</w:t>
       </w:r>
     </w:p>
     <w:p>
       <w:pPr>
         <w:pStyle w:val="ListBullet"/>
-        <w:jc w:val="left"/>
       </w:pPr>
       <w:r>
-        <w:t>• Action Layer: PyAutoGUI intercepts the classified gestures and fires global OS keyboard events (e.g., ArrowRight, ArrowLeft), allowing the app to control any software running in the background.</w:t>
+        <w:t>• Customizable Keybinding GUI: Develop a settings panel allowing end-users to dynamically map detected gestures to arbitrary OS-level keyboard shortcuts (e.g., Mapping 'Fist' to Alt+Tab instead of End).</w:t>
       </w:r>
     </w:p>
     <w:p>
+      <w:pPr>
+        <w:pStyle w:val="ListBullet"/>
+      </w:pPr>
       <w:r>
-        <w:br w:type="page"/>
+        <w:t>• WebRTC Integration: Expand the web environment to support decentralized, remote presentation control using WebRTC protocols.</w:t>
       </w:r>
     </w:p>
     <w:p>
       <w:pPr>
         <w:pStyle w:val="Heading1"/>
-        <w:jc w:val="left"/>
       </w:pPr>
       <w:r>
-        <w:t>3. Algorithmic Implementation</w:t>
-      </w:r>
-    </w:p>
-    <w:p>
-      <w:pPr>
-        <w:jc w:val="left"/>
-      </w:pPr>
-      <w:r>
-        <w:t>The core logic of FlowMinds relies on deterministic spatial algorithms applied to the 21-point hand landmark topography generated by MediaPipe. Each landmark corresponds to a specific joint on the human hand. The origin (0) is the wrist, and the fingertips are located at indices 8 (Index), 12 (Middle), 16 (Ring), and 20 (Pinky).</w:t>
-      </w:r>
-    </w:p>
-    <w:p>
-      <w:pPr>
-        <w:pStyle w:val="Heading2"/>
-        <w:jc w:val="left"/>
-      </w:pPr>
-      <w:r>
-        <w:t>3.1 Finger State Analysis Algorithm</w:t>
-      </w:r>
-    </w:p>
-    <w:p>
-      <w:pPr>
-        <w:jc w:val="left"/>
-      </w:pPr>
-      <w:r>
-        <w:t>To determine if a specific finger is 'open' or 'closed', the system compares the Y-coordinate of the fingertip to the Y-coordinate of its corresponding lower knuckle (PIP joint). Since the Y-axis increases downwards in image coordinates, a finger is considered OPEN if its tip is geometrically HIGHER (less than) its knuckle.</w:t>
-      </w:r>
-    </w:p>
-    <w:p>
-      <w:pPr>
-        <w:jc w:val="left"/>
-      </w:pPr>
-      <w:r>
-        <w:t>Algorithm logic for detecting an open hand (Swipe Gestures):</w:t>
-      </w:r>
-    </w:p>
-    <w:p>
-      <w:pPr>
-        <w:jc w:val="left"/>
-      </w:pPr>
-      <w:r>
-        <w:t>1. Define tip indices: [8, 12, 16, 20]</w:t>
-      </w:r>
-    </w:p>
-    <w:p>
-      <w:pPr>
-        <w:jc w:val="left"/>
-      </w:pPr>
-      <w:r>
-        <w:t>2. Define mid-joint indices: [6, 10, 14, 18]</w:t>
-      </w:r>
-    </w:p>
-    <w:p>
-      <w:pPr>
-        <w:jc w:val="left"/>
-      </w:pPr>
-      <w:r>
-        <w:t>3. Condition: For each i in [0..3], check if landmark[tips[i]].y &lt; landmark[mids[i]].y</w:t>
-      </w:r>
-    </w:p>
-    <w:p>
-      <w:pPr>
-        <w:jc w:val="left"/>
-      </w:pPr>
-      <w:r>
-        <w:t>If all conditions evaluate to True, the hand is fully open. The system then evaluates the X-coordinate of the thumb (landmark 4) relative to the index finger (landmark 8) to differentiate between the Right Hand (Next Slide) and Left Hand (Previous Slide).</w:t>
-      </w:r>
-    </w:p>
-    <w:p>
-      <w:pPr>
-        <w:pStyle w:val="Heading2"/>
-        <w:jc w:val="left"/>
-      </w:pPr>
-      <w:r>
-        <w:t>3.2 The V-Gesture (Laser Pointer Toggle)</w:t>
-      </w:r>
-    </w:p>
-    <w:p>
-      <w:pPr>
-        <w:jc w:val="left"/>
-      </w:pPr>
-      <w:r>
-        <w:t>The V-Gesture is utilized to toggle the virtual laser pointer. The mathematical constraints for this gesture are highly specific to avoid false positives:</w:t>
+        <w:t>10. Contributors</w:t>
       </w:r>
     </w:p>
     <w:p>
       <w:pPr>
         <w:pStyle w:val="ListBullet"/>
-        <w:jc w:val="left"/>
       </w:pPr>
       <w:r>
-        <w:t>• Index Finger: OPEN (lm[8].y &lt; lm[6].y)</w:t>
+        <w:t>• Bashar Haidar - Core Developer</w:t>
       </w:r>
     </w:p>
     <w:p>
       <w:pPr>
         <w:pStyle w:val="ListBullet"/>
-        <w:jc w:val="left"/>
       </w:pPr>
       <w:r>
-        <w:t>• Middle Finger: OPEN (lm[12].y &lt; lm[10].y)</w:t>
-      </w:r>
-    </w:p>
-    <w:p>
-      <w:pPr>
-        <w:pStyle w:val="ListBullet"/>
-        <w:jc w:val="left"/>
-      </w:pPr>
-      <w:r>
-        <w:t>• Ring Finger: CLOSED (lm[16].y &gt; lm[14].y)</w:t>
-      </w:r>
-    </w:p>
-    <w:p>
-      <w:pPr>
-        <w:pStyle w:val="ListBullet"/>
-        <w:jc w:val="left"/>
-      </w:pPr>
-      <w:r>
-        <w:t>• Pinky Finger: CLOSED (lm[20].y &gt; lm[18].y)</w:t>
-      </w:r>
-    </w:p>
-    <w:p>
-      <w:pPr>
-        <w:pStyle w:val="Heading2"/>
-        <w:jc w:val="left"/>
-      </w:pPr>
-      <w:r>
-        <w:t>3.3 State Machine and Temporal Holds</w:t>
-      </w:r>
-    </w:p>
-    <w:p>
-      <w:pPr>
-        <w:jc w:val="left"/>
-      </w:pPr>
-      <w:r>
-        <w:t>Certain actions are destructive or highly disruptive (e.g., jumping to the last slide, toggling the laser). To prevent accidental triggers from momentary hand spasms, the system implements a Temporal State Machine.</w:t>
-      </w:r>
-    </w:p>
-    <w:p>
-      <w:pPr>
-        <w:jc w:val="left"/>
-      </w:pPr>
-      <w:r>
-        <w:t>When a gesture like a 'Fist' (all tips &gt; mids) is detected, the system records a timestamp (fistGestureStartTime). On every subsequent frame, it calculates the elapsed time (Δt). Only when Δt exceeds a predefined threshold (e.g., 4000ms), does the state machine transition and trigger the action. If the gesture is broken at any point before the threshold, the timer instantly resets to 0.</w:t>
-      </w:r>
-    </w:p>
-    <w:p>
-      <w:pPr>
-        <w:pStyle w:val="Heading2"/>
-        <w:jc w:val="left"/>
-      </w:pPr>
-      <w:r>
-        <w:t>3.4 Laser Pointer Kinematics</w:t>
-      </w:r>
-    </w:p>
-    <w:p>
-      <w:pPr>
-        <w:jc w:val="left"/>
-      </w:pPr>
-      <w:r>
-        <w:t>When the laser pointer state is active, the system extracts the normalized coordinates (x, y) of the index fingertip (landmark 8). Because webcams mirror the user horizontally (for natural UX), the X-coordinate is inverted using the formula: Real_X = (1 - lm[8].x) * Container_Width. This mapped coordinate is then used to dynamically translate an absolute HTML DOM element (the laser dot) over the presentation canvas.</w:t>
+        <w:t>• Lana Kara Mohammed - Core Developer</w:t>
       </w:r>
     </w:p>
     <w:p>
       <w:r>
-        <w:br w:type="page"/>
-      </w:r>
-    </w:p>
-    <w:p>
-      <w:pPr>
-        <w:pStyle w:val="Heading1"/>
-        <w:jc w:val="left"/>
-      </w:pPr>
-      <w:r>
-        <w:t>4. Continuous Integration &amp; Continuous Deployment (CI/CD)</w:t>
-      </w:r>
-    </w:p>
-    <w:p>
-      <w:pPr>
-        <w:jc w:val="left"/>
-      </w:pPr>
-      <w:r>
-        <w:t>FlowMinds utilizes advanced GitHub Actions workflows to guarantee that code changes are continuously tested, compiled, and deployed without human intervention.</w:t>
-      </w:r>
-    </w:p>
-    <w:p>
-      <w:pPr>
-        <w:pStyle w:val="Heading2"/>
-        <w:jc w:val="left"/>
-      </w:pPr>
-      <w:r>
-        <w:t>4.1 Web Deployment Pipeline (static.yml)</w:t>
-      </w:r>
-    </w:p>
-    <w:p>
-      <w:pPr>
-        <w:jc w:val="left"/>
-      </w:pPr>
-      <w:r>
-        <w:t>The static web deployment pipeline runs entirely in the cloud. Upon a push to the `main` branch, the workflow checks out the repository and specifically targets the `web/` directory. It packages the client-side JavaScript, CSS, and HTML into a GitHub Pages artifact. This guarantees that the live website remains lightweight and is not polluted with Python backend code.</w:t>
-      </w:r>
-    </w:p>
-    <w:p>
-      <w:pPr>
-        <w:pStyle w:val="Heading2"/>
-        <w:jc w:val="left"/>
-      </w:pPr>
-      <w:r>
-        <w:t>4.2 Multi-OS Desktop Compilation (build.yml)</w:t>
-      </w:r>
-    </w:p>
-    <w:p>
-      <w:pPr>
-        <w:jc w:val="left"/>
-      </w:pPr>
-      <w:r>
-        <w:t>Deploying Python desktop applications natively requires OS-specific compilation. The `build.yml` workflow utilizes a GitHub Actions Matrix Strategy to spin up both `ubuntu-latest` (for potential linux builds), `macos-latest`, and `windows-latest` virtual machines concurrently.</w:t>
-      </w:r>
-    </w:p>
-    <w:p>
-      <w:pPr>
-        <w:jc w:val="left"/>
-      </w:pPr>
-      <w:r>
-        <w:t>The pipeline executes the following sequence on each VM:</w:t>
-      </w:r>
-    </w:p>
-    <w:p>
-      <w:pPr>
-        <w:pStyle w:val="ListBullet"/>
-        <w:jc w:val="left"/>
-      </w:pPr>
-      <w:r>
-        <w:t>1. Setup Python 3.11 environment.</w:t>
-      </w:r>
-    </w:p>
-    <w:p>
-      <w:pPr>
-        <w:pStyle w:val="ListBullet"/>
-        <w:jc w:val="left"/>
-      </w:pPr>
-      <w:r>
-        <w:t>2. Navigate into the `src/` directory and install runtime dependencies.</w:t>
-      </w:r>
-    </w:p>
-    <w:p>
-      <w:pPr>
-        <w:pStyle w:val="ListBullet"/>
-        <w:jc w:val="left"/>
-      </w:pPr>
-      <w:r>
-        <w:t>3. Invoke PyInstaller using the customized `gestures.spec` file, which bundles the Python interpreter, OpenCV binaries, and the MediaPipe task models into a single, standalone executable.</w:t>
-      </w:r>
-    </w:p>
-    <w:p>
-      <w:pPr>
-        <w:pStyle w:val="ListBullet"/>
-        <w:jc w:val="left"/>
-      </w:pPr>
-      <w:r>
-        <w:t>4. Compress the output artifacts and upload them to the GitHub run, allowing end-users to download a plug-and-play version of the software without needing Python installed on their local machines.</w:t>
-      </w:r>
-    </w:p>
-    <w:p>
-      <w:pPr>
-        <w:pStyle w:val="Heading1"/>
-        <w:jc w:val="left"/>
-      </w:pPr>
-      <w:r>
-        <w:t>5. Conclusion and Future Work</w:t>
-      </w:r>
-    </w:p>
-    <w:p>
-      <w:pPr>
-        <w:jc w:val="left"/>
-      </w:pPr>
-      <w:r>
-        <w:t>FlowMinds successfully proves the viability of using standard RGB webcams for high-precision, low-latency spatial interactions. By completely decoupling the presentation layer from the algorithmic backend, the project achieves an incredibly robust and scalable architecture.</w:t>
-      </w:r>
-    </w:p>
-    <w:p>
-      <w:pPr>
-        <w:jc w:val="left"/>
-      </w:pPr>
-      <w:r>
-        <w:t>Future iterations will explore integrating Dynamic Time Warping (DTW) algorithms to detect temporal gestures (e.g., drawing shapes in the air) and expanding the web application to support WebRTC for remote, cross-device presentation control.</w:t>
+        <w:rPr>
+          <w:i/>
+        </w:rPr>
+        <w:br/>
+        <w:t>Project developed for the Embodied Interaction Course - SS2026 at Universität.</w:t>
       </w:r>
     </w:p>
     <w:sectPr>
@@ -862,8 +974,8 @@
     <w:qFormat/>
     <w:rsid w:val="00FC693F"/>
     <w:rPr>
-      <w:b/>
-      <w:sz w:val="24"/>
+      <w:rFonts w:ascii="Courier New" w:hAnsi="Courier New"/>
+      <w:sz w:val="18"/>
     </w:rPr>
   </w:style>
   <w:style w:type="paragraph" w:styleId="Header">

</xml_diff>

<commit_message>
docs: merge academic algorithmic logic with structured architectural tables
</commit_message>
<xml_diff>
--- a/docs/FlowMinds_Documentation.docx
+++ b/docs/FlowMinds_Documentation.docx
@@ -21,12 +21,12 @@
         <w:pStyle w:val="Heading1"/>
       </w:pPr>
       <w:r>
-        <w:t>1. Overview</w:t>
+        <w:t>1. Abstract &amp; Introduction</w:t>
       </w:r>
     </w:p>
     <w:p>
       <w:r>
-        <w:t>FlowMinds is an embodied interaction system designed to seamlessly bridge the gap between human kinetic expression and digital control. Built for the Embodied Interaction (SS2026) course, the project replaces traditional presentation remotes and keyboards with intuitive, computer-vision-based gesture recognition. It allows users to control both native desktop presentations (e.g., PowerPoint, Keynote) and web-based PDF slides entirely through natural hand gestures captured by a standard webcam.</w:t>
+        <w:t>In the modern era of digital presentations, presenters often find themselves tethered to physical devices such as laptops, keyboards, or handheld clickers. FlowMinds was developed to bridge the gap between human kinetic expression and digital control, fulfilling the core principles of Embodied Interaction. By leveraging state-of-the-art Computer Vision (CV) algorithms and Machine Learning (ML) pipelines, FlowMinds allows users to control both native desktop presentations (e.g., PowerPoint, Keynote) and web-based PDF slides entirely through natural hand gestures captured by a standard webcam.</w:t>
       </w:r>
     </w:p>
     <w:p>
@@ -39,7 +39,7 @@
     </w:p>
     <w:p>
       <w:r>
-        <w:t>The system adopts a Monorepo architecture, clearly separating the client-side web application (web/) and the native desktop application (src/). The core data flow for the gesture recognition pipeline is as follows:</w:t>
+        <w:t>To ensure high maintainability and compliance with enterprise software standards, the project adopts a Monorepo architecture, cleanly separating the client-side web application (web/), the native desktop application (src/), and documentation into isolated domains.</w:t>
       </w:r>
     </w:p>
     <w:p>
@@ -76,15 +76,39 @@
     </w:p>
     <w:p>
       <w:pPr>
+        <w:pStyle w:val="ListBullet"/>
+      </w:pPr>
+      <w:r>
+        <w:t>• Web Environment (WASM): Executes fully client-side ensuring zero-dependency overhead, privacy, and ultra-low latency. UI is controlled via CSS variables and JavaScript Intersection Observers.</w:t>
+      </w:r>
+    </w:p>
+    <w:p>
+      <w:pPr>
+        <w:pStyle w:val="ListBullet"/>
+      </w:pPr>
+      <w:r>
+        <w:t>• Desktop Environment (Native): Acts as a bridge between CV and OS-level hardware interrupts using PyAutoGUI to simulate global keyboard and mouse events.</w:t>
+      </w:r>
+    </w:p>
+    <w:p>
+      <w:pPr>
         <w:pStyle w:val="Heading1"/>
       </w:pPr>
       <w:r>
-        <w:t>3. Requirements</w:t>
+        <w:t>3. Requirements &amp; Installation</w:t>
+      </w:r>
+    </w:p>
+    <w:p>
+      <w:pPr>
+        <w:pStyle w:val="Heading2"/>
+      </w:pPr>
+      <w:r>
+        <w:t>Requirements</w:t>
       </w:r>
     </w:p>
     <w:p>
       <w:r>
-        <w:t>To run the Desktop Application (src/) locally or build it from source, the following precise environment is required:</w:t>
+        <w:t>To run the Desktop Application locally or build it from source, the following environment is required:</w:t>
       </w:r>
     </w:p>
     <w:p>
@@ -108,40 +132,15 @@
         <w:pStyle w:val="ListBullet"/>
       </w:pPr>
       <w:r>
-        <w:t>• Libraries &amp; Dependencies:</w:t>
-      </w:r>
-    </w:p>
-    <w:p>
-      <w:r>
-        <w:t xml:space="preserve">  - opencv-python (v4.8.x+)</w:t>
-      </w:r>
-    </w:p>
-    <w:p>
-      <w:r>
-        <w:t xml:space="preserve">  - mediapipe (v0.10.8+)</w:t>
-      </w:r>
-    </w:p>
-    <w:p>
-      <w:r>
-        <w:t xml:space="preserve">  - PyAutoGUI (v0.9.54+)</w:t>
-      </w:r>
-    </w:p>
-    <w:p>
-      <w:r>
-        <w:t xml:space="preserve">  - pyinstaller (v6.3.0+)</w:t>
+        <w:t>• Libraries: opencv-python (v4.8.x+), mediapipe (v0.10.8+), PyAutoGUI (v0.9.54+), pyinstaller (v6.3.0+)</w:t>
       </w:r>
     </w:p>
     <w:p>
       <w:pPr>
-        <w:pStyle w:val="Heading1"/>
+        <w:pStyle w:val="Heading2"/>
       </w:pPr>
       <w:r>
-        <w:t>4. Installation</w:t>
-      </w:r>
-    </w:p>
-    <w:p>
-      <w:r>
-        <w:t>Follow these step-by-step instructions to run the Python Desktop application locally.</w:t>
+        <w:t>Installation</w:t>
       </w:r>
     </w:p>
     <w:p>
@@ -188,12 +187,76 @@
         <w:pStyle w:val="Heading1"/>
       </w:pPr>
       <w:r>
+        <w:t>4. Algorithmic Implementation (Core Logic)</w:t>
+      </w:r>
+    </w:p>
+    <w:p>
+      <w:r>
+        <w:t>The core logic of FlowMinds relies on deterministic spatial algorithms applied to the 21-point hand landmark topography generated by MediaPipe.</w:t>
+      </w:r>
+    </w:p>
+    <w:p>
+      <w:pPr>
+        <w:pStyle w:val="Heading2"/>
+      </w:pPr>
+      <w:r>
+        <w:t>4.1 Finger State Analysis Algorithm</w:t>
+      </w:r>
+    </w:p>
+    <w:p>
+      <w:r>
+        <w:t>To determine if a specific finger is 'open' or 'closed', the system compares the Y-coordinate of the fingertip to the Y-coordinate of its corresponding lower knuckle (PIP joint). Since the Y-axis increases downwards in image coordinates, a finger is considered OPEN if its tip is geometrically HIGHER (less than) its knuckle.</w:t>
+      </w:r>
+    </w:p>
+    <w:p>
+      <w:r>
+        <w:t>Algorithm logic for detecting an open hand (Swipe Gestures):</w:t>
+      </w:r>
+    </w:p>
+    <w:p>
+      <w:r>
+        <w:t>1. Define tip indices: [8, 12, 16, 20]</w:t>
+      </w:r>
+    </w:p>
+    <w:p>
+      <w:r>
+        <w:t>2. Define mid-joint indices: [6, 10, 14, 18]</w:t>
+      </w:r>
+    </w:p>
+    <w:p>
+      <w:r>
+        <w:t>3. Condition: For each i in [0..3], check if landmark[tips[i]].y &lt; landmark[mids[i]].y</w:t>
+      </w:r>
+    </w:p>
+    <w:p>
+      <w:r>
+        <w:t>If all conditions evaluate to True, the hand is fully open. The system then evaluates the X-coordinate of the thumb (landmark 4) relative to the index finger (landmark 8) to differentiate between the Right Hand (Next Slide) and Left Hand (Previous Slide).</w:t>
+      </w:r>
+    </w:p>
+    <w:p>
+      <w:pPr>
+        <w:pStyle w:val="Heading2"/>
+      </w:pPr>
+      <w:r>
+        <w:t>4.2 Laser Pointer Kinematics</w:t>
+      </w:r>
+    </w:p>
+    <w:p>
+      <w:r>
+        <w:t>When the laser pointer state is active, the system extracts the normalized coordinates (x, y) of the index fingertip (landmark 8). Because webcams mirror the user horizontally (for natural UX), the X-coordinate is inverted using the formula: Real_X = (1 - lm[8].x) * Container_Width. This mapped coordinate dynamically translates an absolute HTML DOM element (or native OS cursor) over the presentation canvas.</w:t>
+      </w:r>
+    </w:p>
+    <w:p>
+      <w:pPr>
+        <w:pStyle w:val="Heading1"/>
+      </w:pPr>
+      <w:r>
         <w:t>5. Gesture Reference Table</w:t>
       </w:r>
     </w:p>
     <w:p>
       <w:r>
-        <w:t>The following table maps the supported physical hand gestures to their corresponding digital actions and details the mathematical landmark constraints used for classification.</w:t>
+        <w:t>The following table maps the physical gestures to digital actions and details the logic constraints used for classification.</w:t>
       </w:r>
     </w:p>
     <w:tbl>
@@ -401,6 +464,11 @@
       </w:tr>
     </w:tbl>
     <w:p>
+      <w:r>
+        <w:br w:type="page"/>
+      </w:r>
+    </w:p>
+    <w:p>
       <w:pPr>
         <w:pStyle w:val="Heading1"/>
       </w:pPr>
@@ -410,7 +478,7 @@
     </w:p>
     <w:p>
       <w:r>
-        <w:t>Handling multiple concurrent gestures requires robust 'Conflict Guards' to ensure deterministic behavior and prevent erratic UX.</w:t>
+        <w:t>Handling multiple concurrent gestures requires robust 'Conflict Guards' to prevent erratic UX.</w:t>
       </w:r>
     </w:p>
     <w:p>
@@ -418,7 +486,7 @@
         <w:pStyle w:val="ListBullet"/>
       </w:pPr>
       <w:r>
-        <w:t>• Fist vs. Laser Conflict Guard: A conditional guard `if (isFist(lm) &amp;&amp; !laserActive)` was introduced. This ensures that if the laser pointer is currently active, curling the hand into a fist (either to turn off the laser or accidentally) will completely bypass the 'Fist -&gt; Last Slide' state machine.</w:t>
+        <w:t>• Fist vs. Laser Conflict Guard: A conditional guard `if (isFist(lm) &amp;&amp; !laserActive)` ensures that if the laser pointer is active, curling the hand into a fist (either to turn off the laser or accidentally) will bypass the 'Fist -&gt; Last Slide' state machine completely.</w:t>
       </w:r>
     </w:p>
     <w:p>
@@ -426,7 +494,7 @@
         <w:pStyle w:val="ListBullet"/>
       </w:pPr>
       <w:r>
-        <w:t>• V-Gesture vs. Swipe Guard: The V-gesture logic actively verifies that the Ring and Pinky fingers are strictly closed (`lm[16].y &gt; lm[14].y`). This prevents an open hand (Swipe) from being misclassified as a V-Gesture when the hand is angled.</w:t>
+        <w:t>• V-Gesture vs. Swipe Guard: The V-gesture logic actively verifies that the Ring and Pinky fingers are strictly closed (`lm[16].y &gt; lm[14].y`). This prevents an open hand (Swipe) from being misclassified as a V-Gesture when angled.</w:t>
       </w:r>
     </w:p>
     <w:p>
@@ -434,7 +502,7 @@
         <w:pStyle w:val="Heading1"/>
       </w:pPr>
       <w:r>
-        <w:t>7. Known Issues &amp; Solutions</w:t>
+        <w:t>7. Known Issues &amp; Solutions (Temporal State Machines)</w:t>
       </w:r>
     </w:p>
     <w:p>
@@ -458,7 +526,7 @@
         <w:pStyle w:val="ListBullet"/>
       </w:pPr>
       <w:r>
-        <w:t>• Solution: Implemented a Temporal State Machine (Hold Timer) with a 4.0-second threshold. A `fistGestureStartTime` variable tracks the initial detection timestamp. The system evaluates Δt continuously and renders a countdown timer on the UI. If the gesture is broken before Δt &gt; 4000ms, the timer resets instantly.</w:t>
+        <w:t>• Solution: Implemented a Temporal State Machine (Hold Timer) with a 4.0-second threshold. A fistGestureStartTime variable tracks the initial detection timestamp. The system evaluates Δt continuously and renders a countdown timer on the UI. If the gesture is broken before Δt &gt; 4000ms, the timer resets instantly.</w:t>
       </w:r>
     </w:p>
     <w:p>
@@ -474,7 +542,7 @@
         <w:pStyle w:val="ListBullet"/>
       </w:pPr>
       <w:r>
-        <w:t>• Problem: Originally, a swipe gesture was utilized to toggle the laser pointer. This proved highly unstable as standard slide-switching swipes frequently triggered the laser, causing massive conflicts. Additionally, a legacy 'Pen Mode' (Stift) compounded the interference.</w:t>
+        <w:t>• Problem: Originally, a swipe gesture was utilized to toggle the laser pointer. This proved highly unstable as standard slide-switching swipes frequently triggered the laser. Additionally, a legacy 'Pen Mode' (Stift) compounded the interference.</w:t>
       </w:r>
     </w:p>
     <w:p>
@@ -495,7 +563,7 @@
     </w:p>
     <w:p>
       <w:r>
-        <w:t>Key threshold values and configurations have been externalized into a dedicated configuration file (web/js/config.js) for rapid adjustment without digging through core logic.</w:t>
+        <w:t>Key threshold values and configurations have been externalized into a dedicated configuration file (web/js/config.js) for rapid adjustment.</w:t>
       </w:r>
     </w:p>
     <w:p>
@@ -548,7 +616,7 @@
         <w:pStyle w:val="ListBullet"/>
       </w:pPr>
       <w:r>
-        <w:t>• Dynamic Time Warping (DTW): Implement sequence-based gesture recognition to allow users to draw specific shapes (e.g., circles to highlight areas) rather than relying purely on static poses.</w:t>
+        <w:t>• Dynamic Time Warping (DTW): Implement sequence-based gesture recognition to allow users to draw specific shapes rather than relying purely on static poses.</w:t>
       </w:r>
     </w:p>
     <w:p>
@@ -556,7 +624,7 @@
         <w:pStyle w:val="ListBullet"/>
       </w:pPr>
       <w:r>
-        <w:t>• Customizable Keybinding GUI: Develop a settings panel allowing end-users to dynamically map detected gestures to arbitrary OS-level keyboard shortcuts (e.g., Mapping 'Fist' to Alt+Tab instead of End).</w:t>
+        <w:t>• Customizable Keybinding GUI: Develop a settings panel allowing end-users to dynamically map detected gestures to arbitrary OS-level keyboard shortcuts.</w:t>
       </w:r>
     </w:p>
     <w:p>

</xml_diff>